<commit_message>
Add GitHub evidence and refresh draft lab report
</commit_message>
<xml_diff>
--- a/AI2-LB-grN-nazwisko-imie.docx
+++ b/AI2-LB-grN-nazwisko-imie.docx
@@ -3317,6 +3317,47 @@
         </w:rPr>
         <w:t>DO UZUPEŁNIENIA: własny zrzut przeglądarki z adresem pogodynka.localhost:&lt;numer albumu&gt;, wersją Symfony 7.4.* i ścieżką projektu.</w:t>
       </w:r>
+      <w:r>
+        <w:br/>
+      </w:r>
+      <w:r>
+        <w:drawing>
+          <wp:inline xmlns:a="http://schemas.openxmlformats.org/drawingml/2006/main" xmlns:pic="http://schemas.openxmlformats.org/drawingml/2006/picture">
+            <wp:extent cx="5577840" cy="3873500"/>
+            <wp:docPr id="2046723641" name="Picture 2046723641"/>
+            <wp:cNvGraphicFramePr>
+              <a:graphicFrameLocks noChangeAspect="1"/>
+            </wp:cNvGraphicFramePr>
+            <a:graphic>
+              <a:graphicData uri="http://schemas.openxmlformats.org/drawingml/2006/picture">
+                <pic:pic>
+                  <pic:nvPicPr>
+                    <pic:cNvPr id="0" name="symfony-welcome.png"/>
+                    <pic:cNvPicPr/>
+                  </pic:nvPicPr>
+                  <pic:blipFill>
+                    <a:blip r:embed="rId22"/>
+                    <a:stretch>
+                      <a:fillRect/>
+                    </a:stretch>
+                  </pic:blipFill>
+                  <pic:spPr>
+                    <a:xfrm>
+                      <a:off x="0" y="0"/>
+                      <a:ext cx="5577840" cy="3873500"/>
+                    </a:xfrm>
+                    <a:prstGeom prst="rect"/>
+                  </pic:spPr>
+                </pic:pic>
+              </a:graphicData>
+            </a:graphic>
+          </wp:inline>
+        </w:drawing>
+      </w:r>
+      <w:r>
+        <w:br/>
+        <w:t>Zrzut kontrolny treści strony: http://pogodynka.localhost:8000/. Nie zawiera paska adresu; do oddania wymagany jest nowy zrzut z portem równym numerowi albumu. Zainstalowano Symfony 7.4.21; usunięto Turbo, AssetMapper i Stimulus; pominięto receptury Docker. Lokalna ścieżka projektu: /home/sxmpk/Documents/studia/ai2/lab-b.</w:t>
+      </w:r>
     </w:p>
     <w:tbl>
       <w:tblPr>
@@ -4554,12 +4595,40 @@
         <w:pStyle w:val="Zadanie"/>
         <w:jc w:val="center"/>
       </w:pPr>
-      <w:r>
-        <w:rPr>
-          <w:b/>
-          <w:color w:val="C05000"/>
-        </w:rPr>
-        <w:t>DO UZUPEŁNIENIA: rzeczywisty zrzut strony https://github.com/sxmpk/lab-b/tree/lab-b po wysłaniu kodu.</w:t>
+      <w:r/>
+      <w:r>
+        <w:drawing>
+          <wp:inline xmlns:a="http://schemas.openxmlformats.org/drawingml/2006/main" xmlns:pic="http://schemas.openxmlformats.org/drawingml/2006/picture">
+            <wp:extent cx="5577840" cy="5035550"/>
+            <wp:docPr id="2046723642" name="Picture 2046723642"/>
+            <wp:cNvGraphicFramePr>
+              <a:graphicFrameLocks noChangeAspect="1"/>
+            </wp:cNvGraphicFramePr>
+            <a:graphic>
+              <a:graphicData uri="http://schemas.openxmlformats.org/drawingml/2006/picture">
+                <pic:pic>
+                  <pic:nvPicPr>
+                    <pic:cNvPr id="0" name="github-lab-b.png"/>
+                    <pic:cNvPicPr/>
+                  </pic:nvPicPr>
+                  <pic:blipFill>
+                    <a:blip r:embed="rId23"/>
+                    <a:stretch>
+                      <a:fillRect/>
+                    </a:stretch>
+                  </pic:blipFill>
+                  <pic:spPr>
+                    <a:xfrm>
+                      <a:off x="0" y="0"/>
+                      <a:ext cx="5577840" cy="5035550"/>
+                    </a:xfrm>
+                    <a:prstGeom prst="rect"/>
+                  </pic:spPr>
+                </pic:pic>
+              </a:graphicData>
+            </a:graphic>
+          </wp:inline>
+        </w:drawing>
       </w:r>
     </w:p>
     <w:tbl>

</xml_diff>